<commit_message>
Update reflection doc and rename group file
Updated TAPIA_FELIPE_3.2_APT122_DiarioReflexionFase3.docx with new content and renamed 'Grupo y link github.xlsx' to 'Grupo + link Github.xlsx' for improved clarity.
</commit_message>
<xml_diff>
--- a/Fase 3/Evidencias Individuales/TAPIA_FELIPE_3.2_APT122_DiarioReflexionFase3.docx
+++ b/Fase 3/Evidencias Individuales/TAPIA_FELIPE_3.2_APT122_DiarioReflexionFase3.docx
@@ -926,7 +926,29 @@
               <w:jc w:val="both"/>
               <w:rPr>
                 <w:rFonts w:eastAsiaTheme="majorEastAsia"/>
+                <w:b/>
+                <w:bCs/>
                 <w:color w:val="767171" w:themeColor="background2" w:themeShade="80"/>
+                <w:sz w:val="24"/>
+                <w:szCs w:val="24"/>
+              </w:rPr>
+            </w:pPr>
+            <w:r>
+              <w:rPr>
+                <w:rFonts w:eastAsiaTheme="majorEastAsia"/>
+                <w:b/>
+                <w:bCs/>
+                <w:sz w:val="24"/>
+                <w:szCs w:val="24"/>
+              </w:rPr>
+              <w:t>¿Luego de haber realizado tu Proyecto APT han cambiado tus proyecciones laborales? ¿De qué manera han cambiado?</w:t>
+            </w:r>
+          </w:p>
+          <w:p>
+            <w:pPr>
+              <w:jc w:val="both"/>
+              <w:rPr>
+                <w:rFonts w:eastAsiaTheme="majorEastAsia"/>
                 <w:sz w:val="24"/>
                 <w:szCs w:val="24"/>
               </w:rPr>
@@ -937,7 +959,7 @@
                 <w:sz w:val="24"/>
                 <w:szCs w:val="24"/>
               </w:rPr>
-              <w:t>¿Luego de haber realizado tu Proyecto APT han cambiado tus proyecciones laborales? ¿De qué manera han cambiado?</w:t>
+              <w:t>Sí, ahora pienso que tengo un mayor impacto como líder de grupo, esto podría llevarme a buscar otros trabajos</w:t>
             </w:r>
           </w:p>
           <w:p>
@@ -950,6 +972,8 @@
               <w:jc w:val="both"/>
               <w:rPr>
                 <w:rFonts w:eastAsiaTheme="majorEastAsia"/>
+                <w:b/>
+                <w:bCs/>
                 <w:color w:val="767171" w:themeColor="background2" w:themeShade="80"/>
                 <w:sz w:val="24"/>
                 <w:szCs w:val="24"/>
@@ -958,6 +982,8 @@
             <w:r>
               <w:rPr>
                 <w:rFonts w:eastAsiaTheme="majorEastAsia"/>
+                <w:b/>
+                <w:bCs/>
                 <w:sz w:val="24"/>
                 <w:szCs w:val="24"/>
               </w:rPr>
@@ -969,22 +995,18 @@
               <w:jc w:val="both"/>
               <w:rPr>
                 <w:rFonts w:ascii="Calibri" w:hAnsi="Calibri"/>
-                <w:b/>
-                <w:bCs/>
-                <w:color w:val="1F4E79" w:themeColor="accent1" w:themeShade="80"/>
+                <w:sz w:val="24"/>
+                <w:szCs w:val="24"/>
               </w:rPr>
             </w:pPr>
-          </w:p>
-          <w:p>
-            <w:pPr>
-              <w:jc w:val="both"/>
+            <w:r>
               <w:rPr>
                 <w:rFonts w:ascii="Calibri" w:hAnsi="Calibri"/>
-                <w:b/>
-                <w:bCs/>
-                <w:color w:val="1F4E79" w:themeColor="accent1" w:themeShade="80"/>
+                <w:sz w:val="24"/>
+                <w:szCs w:val="24"/>
               </w:rPr>
-            </w:pPr>
+              <w:t>Dirigiendo mi propia consultora de Software</w:t>
+            </w:r>
           </w:p>
           <w:p>
             <w:pPr>
@@ -1111,7 +1133,28 @@
               <w:jc w:val="both"/>
               <w:rPr>
                 <w:rFonts w:eastAsiaTheme="majorEastAsia"/>
+                <w:b/>
+                <w:bCs/>
                 <w:color w:val="767171" w:themeColor="background2" w:themeShade="80"/>
+                <w:sz w:val="24"/>
+                <w:szCs w:val="24"/>
+              </w:rPr>
+            </w:pPr>
+            <w:r>
+              <w:rPr>
+                <w:rFonts w:eastAsiaTheme="majorEastAsia"/>
+                <w:b/>
+                <w:bCs/>
+                <w:sz w:val="24"/>
+                <w:szCs w:val="24"/>
+              </w:rPr>
+              <w:t>¿Qué aspectos positivos y negativos identificas del trabajo en grupo realizado en esta asignatura?</w:t>
+            </w:r>
+          </w:p>
+          <w:p>
+            <w:pPr>
+              <w:rPr>
+                <w:rFonts w:eastAsiaTheme="majorEastAsia"/>
                 <w:sz w:val="24"/>
                 <w:szCs w:val="24"/>
               </w:rPr>
@@ -1122,7 +1165,24 @@
                 <w:sz w:val="24"/>
                 <w:szCs w:val="24"/>
               </w:rPr>
-              <w:t>¿Qué aspectos positivos y negativos identificas del trabajo en grupo realizado en esta asignatura?</w:t>
+              <w:t>Positivo: El compromiso para entregar toda la documentación en la entrega final</w:t>
+            </w:r>
+            <w:r>
+              <w:rPr>
+                <w:rFonts w:eastAsiaTheme="majorEastAsia"/>
+                <w:sz w:val="24"/>
+                <w:szCs w:val="24"/>
+              </w:rPr>
+              <w:br/>
+              <w:t xml:space="preserve">Negativo: </w:t>
+            </w:r>
+            <w:r>
+              <w:rPr>
+                <w:rFonts w:eastAsiaTheme="majorEastAsia"/>
+                <w:sz w:val="24"/>
+                <w:szCs w:val="24"/>
+              </w:rPr>
+              <w:t>El poco trabajo de algunos y el mucho de trabajo de otros</w:t>
             </w:r>
           </w:p>
           <w:p>
@@ -1134,6 +1194,8 @@
               </w:numPr>
               <w:jc w:val="both"/>
               <w:rPr>
+                <w:b/>
+                <w:bCs/>
                 <w:sz w:val="24"/>
                 <w:szCs w:val="24"/>
               </w:rPr>
@@ -1141,10 +1203,35 @@
             <w:r>
               <w:rPr>
                 <w:rFonts w:eastAsiaTheme="majorEastAsia"/>
+                <w:b/>
+                <w:bCs/>
                 <w:sz w:val="24"/>
                 <w:szCs w:val="24"/>
               </w:rPr>
               <w:t>¿En qué aspectos crees que podrías mejorar para tus próximos trabajos en grupo dentro de contextos laborales?</w:t>
+            </w:r>
+          </w:p>
+          <w:p>
+            <w:pPr>
+              <w:jc w:val="both"/>
+              <w:rPr>
+                <w:sz w:val="24"/>
+                <w:szCs w:val="24"/>
+              </w:rPr>
+            </w:pPr>
+            <w:r>
+              <w:rPr>
+                <w:sz w:val="24"/>
+                <w:szCs w:val="24"/>
+              </w:rPr>
+              <w:t>Siento que debo aprender a exigir el cumplimiento de trabajos en los plazos correspondientes</w:t>
+            </w:r>
+            <w:r>
+              <w:rPr>
+                <w:sz w:val="24"/>
+                <w:szCs w:val="24"/>
+              </w:rPr>
+              <w:t>, también el delegar cosas sin tener miedo a que no queden bien</w:t>
             </w:r>
           </w:p>
           <w:p>
@@ -1204,42 +1291,6 @@
         </w:tc>
       </w:tr>
     </w:tbl>
-    <w:p>
-      <w:pPr>
-        <w:spacing w:after="0" w:line="360" w:lineRule="auto"/>
-        <w:jc w:val="both"/>
-        <w:rPr>
-          <w:color w:val="595959" w:themeColor="text1" w:themeTint="A6"/>
-          <w:sz w:val="24"/>
-          <w:szCs w:val="24"/>
-          <w:lang w:eastAsia="ja-JP"/>
-        </w:rPr>
-      </w:pPr>
-    </w:p>
-    <w:p>
-      <w:pPr>
-        <w:spacing w:after="0" w:line="360" w:lineRule="auto"/>
-        <w:jc w:val="both"/>
-        <w:rPr>
-          <w:color w:val="595959" w:themeColor="text1" w:themeTint="A6"/>
-          <w:sz w:val="24"/>
-          <w:szCs w:val="24"/>
-          <w:lang w:eastAsia="ja-JP"/>
-        </w:rPr>
-      </w:pPr>
-    </w:p>
-    <w:p>
-      <w:pPr>
-        <w:spacing w:after="0" w:line="360" w:lineRule="auto"/>
-        <w:jc w:val="both"/>
-        <w:rPr>
-          <w:color w:val="595959" w:themeColor="text1" w:themeTint="A6"/>
-          <w:sz w:val="24"/>
-          <w:szCs w:val="24"/>
-          <w:lang w:eastAsia="ja-JP"/>
-        </w:rPr>
-      </w:pPr>
-    </w:p>
     <w:p>
       <w:pPr>
         <w:spacing w:after="0" w:line="360" w:lineRule="auto"/>

</xml_diff>